<commit_message>
Repost of discussion board
</commit_message>
<xml_diff>
--- a/Module-4/Module 4.1 Discussion Board/Baldree_Module4.1_DiscussionBoard_CSD340.docx
+++ b/Module-4/Module 4.1 Discussion Board/Baldree_Module4.1_DiscussionBoard_CSD340.docx
@@ -11,6 +11,15 @@
       <w:r>
         <w:t>1/27/26</w:t>
       </w:r>
+      <w:r>
+        <w:t xml:space="preserve"> </w:t>
+      </w:r>
+      <w:r>
+        <w:sym w:font="Wingdings" w:char="F0E0"/>
+      </w:r>
+      <w:r>
+        <w:t xml:space="preserve"> 1/29/26 Reposted</w:t>
+      </w:r>
     </w:p>
     <w:p>
       <w:r>
@@ -25,95 +34,147 @@
     <w:p>
       <w:pPr>
         <w:spacing w:before="100" w:beforeAutospacing="1" w:after="100" w:afterAutospacing="1" w:line="240" w:lineRule="auto"/>
-        <w:outlineLvl w:val="2"/>
-        <w:rPr>
-          <w:rFonts w:ascii="Times New Roman" w:eastAsia="Times New Roman" w:hAnsi="Times New Roman" w:cs="Times New Roman"/>
-          <w:b/>
-          <w:bCs/>
-          <w:color w:val="000000"/>
-          <w:kern w:val="0"/>
-          <w14:ligatures w14:val="none"/>
-        </w:rPr>
-      </w:pPr>
-      <w:r>
-        <w:rPr>
-          <w:rFonts w:ascii="Times New Roman" w:eastAsia="Times New Roman" w:hAnsi="Times New Roman" w:cs="Times New Roman"/>
-          <w:b/>
-          <w:bCs/>
-          <w:color w:val="000000"/>
-          <w:kern w:val="0"/>
-          <w14:ligatures w14:val="none"/>
-        </w:rPr>
-        <w:t xml:space="preserve">#23 – </w:t>
-      </w:r>
-      <w:r>
-        <w:rPr>
-          <w:rFonts w:ascii="Times New Roman" w:eastAsia="Times New Roman" w:hAnsi="Times New Roman" w:cs="Times New Roman"/>
-          <w:b/>
-          <w:bCs/>
-          <w:color w:val="000000"/>
-          <w:kern w:val="0"/>
-          <w14:ligatures w14:val="none"/>
-        </w:rPr>
-        <w:t>Memory Takes A Lot Of Mental Resources</w:t>
-      </w:r>
-    </w:p>
-    <w:p>
-      <w:pPr>
-        <w:pStyle w:val="NormalWeb"/>
-        <w:rPr>
-          <w:color w:val="000000"/>
-        </w:rPr>
-      </w:pPr>
-      <w:r>
-        <w:rPr>
-          <w:rStyle w:val="Strong"/>
-          <w:rFonts w:eastAsiaTheme="majorEastAsia"/>
-          <w:color w:val="000000"/>
-        </w:rPr>
-        <w:t>Summary:</w:t>
-      </w:r>
-      <w:r>
-        <w:rPr>
-          <w:color w:val="000000"/>
-        </w:rPr>
-        <w:br/>
-        <w:t>People have limited memory capacity, and trying to remember too much information at once can be mentally exhausting. When a website forces users to remember instructions, passwords, steps, or where things are located, it increases frustration and the chance of mistakes. Good design reduces how much users need to remember and instead presents information clearly and visibly.</w:t>
-      </w:r>
-    </w:p>
-    <w:p>
-      <w:pPr>
-        <w:pStyle w:val="NormalWeb"/>
-        <w:rPr>
-          <w:color w:val="000000"/>
-        </w:rPr>
-      </w:pPr>
-      <w:r>
-        <w:rPr>
-          <w:rStyle w:val="Strong"/>
-          <w:rFonts w:eastAsiaTheme="majorEastAsia"/>
-          <w:color w:val="000000"/>
+        <w:rPr>
+          <w:rFonts w:ascii="Times New Roman" w:eastAsia="Times New Roman" w:hAnsi="Times New Roman" w:cs="Times New Roman"/>
+          <w:kern w:val="0"/>
+          <w14:ligatures w14:val="none"/>
+        </w:rPr>
+      </w:pPr>
+      <w:r>
+        <w:rPr>
+          <w:rFonts w:ascii="Times New Roman" w:eastAsia="Times New Roman" w:hAnsi="Times New Roman" w:cs="Times New Roman"/>
+          <w:b/>
+          <w:bCs/>
+          <w:kern w:val="0"/>
+          <w14:ligatures w14:val="none"/>
+        </w:rPr>
+        <w:t xml:space="preserve">Topic #29: Minds Wander 30 Percent </w:t>
+      </w:r>
+      <w:proofErr w:type="gramStart"/>
+      <w:r>
+        <w:rPr>
+          <w:rFonts w:ascii="Times New Roman" w:eastAsia="Times New Roman" w:hAnsi="Times New Roman" w:cs="Times New Roman"/>
+          <w:b/>
+          <w:bCs/>
+          <w:kern w:val="0"/>
+          <w14:ligatures w14:val="none"/>
+        </w:rPr>
+        <w:t>Of</w:t>
+      </w:r>
+      <w:proofErr w:type="gramEnd"/>
+      <w:r>
+        <w:rPr>
+          <w:rFonts w:ascii="Times New Roman" w:eastAsia="Times New Roman" w:hAnsi="Times New Roman" w:cs="Times New Roman"/>
+          <w:b/>
+          <w:bCs/>
+          <w:kern w:val="0"/>
+          <w14:ligatures w14:val="none"/>
+        </w:rPr>
+        <w:t xml:space="preserve"> </w:t>
+      </w:r>
+      <w:proofErr w:type="gramStart"/>
+      <w:r>
+        <w:rPr>
+          <w:rFonts w:ascii="Times New Roman" w:eastAsia="Times New Roman" w:hAnsi="Times New Roman" w:cs="Times New Roman"/>
+          <w:b/>
+          <w:bCs/>
+          <w:kern w:val="0"/>
+          <w14:ligatures w14:val="none"/>
+        </w:rPr>
+        <w:t>The</w:t>
+      </w:r>
+      <w:proofErr w:type="gramEnd"/>
+      <w:r>
+        <w:rPr>
+          <w:rFonts w:ascii="Times New Roman" w:eastAsia="Times New Roman" w:hAnsi="Times New Roman" w:cs="Times New Roman"/>
+          <w:b/>
+          <w:bCs/>
+          <w:kern w:val="0"/>
+          <w14:ligatures w14:val="none"/>
+        </w:rPr>
+        <w:t xml:space="preserve"> Time</w:t>
+      </w:r>
+    </w:p>
+    <w:p>
+      <w:pPr>
+        <w:spacing w:before="100" w:beforeAutospacing="1" w:after="100" w:afterAutospacing="1" w:line="240" w:lineRule="auto"/>
+        <w:rPr>
+          <w:rFonts w:ascii="Times New Roman" w:eastAsia="Times New Roman" w:hAnsi="Times New Roman" w:cs="Times New Roman"/>
+          <w:kern w:val="0"/>
+          <w14:ligatures w14:val="none"/>
+        </w:rPr>
+      </w:pPr>
+      <w:r>
+        <w:rPr>
+          <w:rFonts w:ascii="Times New Roman" w:eastAsia="Times New Roman" w:hAnsi="Times New Roman" w:cs="Times New Roman"/>
+          <w:kern w:val="0"/>
+          <w14:ligatures w14:val="none"/>
+        </w:rPr>
+        <w:t>The reading points out that people’s minds wander about 30% of the time, even when they’re doing something that seems simple or routine. This means that designers can’t assume users are paying full attention all the time. If instructions, buttons, or information aren’t clear, people can easily get lost or make mistakes.</w:t>
+      </w:r>
+    </w:p>
+    <w:p>
+      <w:pPr>
+        <w:spacing w:before="100" w:beforeAutospacing="1" w:after="100" w:afterAutospacing="1" w:line="240" w:lineRule="auto"/>
+        <w:rPr>
+          <w:rFonts w:ascii="Times New Roman" w:eastAsia="Times New Roman" w:hAnsi="Times New Roman" w:cs="Times New Roman"/>
+          <w:kern w:val="0"/>
+          <w14:ligatures w14:val="none"/>
+        </w:rPr>
+      </w:pPr>
+      <w:r>
+        <w:rPr>
+          <w:rFonts w:ascii="Times New Roman" w:eastAsia="Times New Roman" w:hAnsi="Times New Roman" w:cs="Times New Roman"/>
+          <w:b/>
+          <w:bCs/>
+          <w:kern w:val="0"/>
+          <w14:ligatures w14:val="none"/>
         </w:rPr>
         <w:t>Embellishment:</w:t>
       </w:r>
       <w:r>
         <w:rPr>
-          <w:color w:val="000000"/>
-        </w:rPr>
-        <w:br/>
-        <w:t>What the reading doesn’t fully emphasize is how memory overload directly affects user confidence and motivation. When users feel mentally drained, they are more likely to abandon a task</w:t>
-      </w:r>
-      <w:r>
-        <w:rPr>
-          <w:color w:val="000000"/>
-        </w:rPr>
-        <w:t xml:space="preserve">; </w:t>
-      </w:r>
-      <w:r>
-        <w:rPr>
-          <w:color w:val="000000"/>
-        </w:rPr>
-        <w:t>even if it’s something simple like filling out a form or navigating a menu. This is especially important for accessibility and mobile users, who often multitask or use smaller screens. Designers can reduce mental strain by breaking tasks into smaller steps, using familiar icons and patterns, and repeating important information when needed. For example, showing progress indicators in multi-step forms helps users feel oriented and reduces anxiety.</w:t>
+          <w:rFonts w:ascii="Times New Roman" w:eastAsia="Times New Roman" w:hAnsi="Times New Roman" w:cs="Times New Roman"/>
+          <w:kern w:val="0"/>
+          <w14:ligatures w14:val="none"/>
+        </w:rPr>
+        <w:t xml:space="preserve"> Something the reading didn’t mention is that mind wandering isn’t always bad. Studies show that when our minds drift, we’re often coming up with creative ideas or solving problems subconsciously. </w:t>
+      </w:r>
+      <w:proofErr w:type="gramStart"/>
+      <w:r>
+        <w:rPr>
+          <w:rFonts w:ascii="Times New Roman" w:eastAsia="Times New Roman" w:hAnsi="Times New Roman" w:cs="Times New Roman"/>
+          <w:kern w:val="0"/>
+          <w14:ligatures w14:val="none"/>
+        </w:rPr>
+        <w:t>So</w:t>
+      </w:r>
+      <w:proofErr w:type="gramEnd"/>
+      <w:r>
+        <w:rPr>
+          <w:rFonts w:ascii="Times New Roman" w:eastAsia="Times New Roman" w:hAnsi="Times New Roman" w:cs="Times New Roman"/>
+          <w:kern w:val="0"/>
+          <w14:ligatures w14:val="none"/>
+        </w:rPr>
+        <w:t xml:space="preserve"> a user might stop paying attention for a moment but could </w:t>
+      </w:r>
+      <w:proofErr w:type="gramStart"/>
+      <w:r>
+        <w:rPr>
+          <w:rFonts w:ascii="Times New Roman" w:eastAsia="Times New Roman" w:hAnsi="Times New Roman" w:cs="Times New Roman"/>
+          <w:kern w:val="0"/>
+          <w14:ligatures w14:val="none"/>
+        </w:rPr>
+        <w:t>actually benefit</w:t>
+      </w:r>
+      <w:proofErr w:type="gramEnd"/>
+      <w:r>
+        <w:rPr>
+          <w:rFonts w:ascii="Times New Roman" w:eastAsia="Times New Roman" w:hAnsi="Times New Roman" w:cs="Times New Roman"/>
+          <w:kern w:val="0"/>
+          <w14:ligatures w14:val="none"/>
+        </w:rPr>
+        <w:t xml:space="preserve"> from that pause. Designers can take advantage of this by making interfaces that allow for small breaks or include visual hints to gently guide users back on track. This way, the design works with natural attention patterns instead of against them.</w:t>
       </w:r>
     </w:p>
     <w:p>
@@ -121,43 +182,41 @@
         <w:spacing w:before="100" w:beforeAutospacing="1" w:after="100" w:afterAutospacing="1" w:line="240" w:lineRule="auto"/>
         <w:rPr>
           <w:rFonts w:ascii="Times New Roman" w:eastAsia="Times New Roman" w:hAnsi="Times New Roman" w:cs="Times New Roman"/>
-          <w:color w:val="000000"/>
-          <w:kern w:val="0"/>
-          <w14:ligatures w14:val="none"/>
-        </w:rPr>
-      </w:pPr>
-      <w:r>
-        <w:rPr>
-          <w:rFonts w:ascii="Times New Roman" w:eastAsia="Times New Roman" w:hAnsi="Times New Roman" w:cs="Times New Roman"/>
-          <w:b/>
-          <w:bCs/>
-          <w:color w:val="000000"/>
+          <w:kern w:val="0"/>
+          <w14:ligatures w14:val="none"/>
+        </w:rPr>
+      </w:pPr>
+      <w:r>
+        <w:rPr>
+          <w:rFonts w:ascii="Times New Roman" w:eastAsia="Times New Roman" w:hAnsi="Times New Roman" w:cs="Times New Roman"/>
+          <w:b/>
+          <w:bCs/>
           <w:kern w:val="0"/>
           <w14:ligatures w14:val="none"/>
         </w:rPr>
         <w:t>Visual Example:</w:t>
       </w:r>
-      <w:r>
-        <w:rPr>
-          <w:rFonts w:ascii="Times New Roman" w:eastAsia="Times New Roman" w:hAnsi="Times New Roman" w:cs="Times New Roman"/>
-          <w:color w:val="000000"/>
-          <w:kern w:val="0"/>
-          <w14:ligatures w14:val="none"/>
-        </w:rPr>
-        <w:br/>
-      </w:r>
+    </w:p>
+    <w:p>
+      <w:pPr>
+        <w:spacing w:before="100" w:beforeAutospacing="1" w:after="100" w:afterAutospacing="1" w:line="240" w:lineRule="auto"/>
+        <w:rPr>
+          <w:rFonts w:ascii="Times New Roman" w:eastAsia="Times New Roman" w:hAnsi="Times New Roman" w:cs="Times New Roman"/>
+          <w:kern w:val="0"/>
+          <w14:ligatures w14:val="none"/>
+        </w:rPr>
+      </w:pPr>
       <w:r>
         <w:rPr>
           <w:rFonts w:ascii="Times New Roman" w:eastAsia="Times New Roman" w:hAnsi="Times New Roman" w:cs="Times New Roman"/>
           <w:noProof/>
-          <w:color w:val="000000"/>
           <w:kern w:val="0"/>
         </w:rPr>
         <w:drawing>
-          <wp:inline distT="0" distB="0" distL="0" distR="0" wp14:anchorId="154F333F" wp14:editId="00E8BDD0">
-            <wp:extent cx="3975100" cy="3511338"/>
-            <wp:effectExtent l="0" t="0" r="0" b="0"/>
-            <wp:docPr id="1315391621" name="Picture 1" descr="A screenshot of a computer&#10;&#10;AI-generated content may be incorrect."/>
+          <wp:inline distT="0" distB="0" distL="0" distR="0" wp14:anchorId="2A808BDB" wp14:editId="41EC66C2">
+            <wp:extent cx="5943600" cy="2905125"/>
+            <wp:effectExtent l="0" t="0" r="0" b="3175"/>
+            <wp:docPr id="664851398" name="Picture 2" descr="A screenshot of a survey&#10;&#10;AI-generated content may be incorrect."/>
             <wp:cNvGraphicFramePr>
               <a:graphicFrameLocks xmlns:a="http://schemas.openxmlformats.org/drawingml/2006/main" noChangeAspect="1"/>
             </wp:cNvGraphicFramePr>
@@ -165,7 +224,7 @@
               <a:graphicData uri="http://schemas.openxmlformats.org/drawingml/2006/picture">
                 <pic:pic xmlns:pic="http://schemas.openxmlformats.org/drawingml/2006/picture">
                   <pic:nvPicPr>
-                    <pic:cNvPr id="1315391621" name="Picture 1" descr="A screenshot of a computer&#10;&#10;AI-generated content may be incorrect."/>
+                    <pic:cNvPr id="664851398" name="Picture 2" descr="A screenshot of a survey&#10;&#10;AI-generated content may be incorrect."/>
                     <pic:cNvPicPr/>
                   </pic:nvPicPr>
                   <pic:blipFill>
@@ -183,7 +242,7 @@
                   <pic:spPr>
                     <a:xfrm>
                       <a:off x="0" y="0"/>
-                      <a:ext cx="3995444" cy="3529308"/>
+                      <a:ext cx="5943600" cy="2905125"/>
                     </a:xfrm>
                     <a:prstGeom prst="rect">
                       <a:avLst/>
@@ -205,133 +264,200 @@
           <w14:ligatures w14:val="none"/>
         </w:rPr>
       </w:pPr>
+    </w:p>
+    <w:p>
+      <w:pPr>
+        <w:spacing w:before="100" w:beforeAutospacing="1" w:after="100" w:afterAutospacing="1" w:line="240" w:lineRule="auto"/>
+        <w:rPr>
+          <w:rFonts w:ascii="Times New Roman" w:eastAsia="Times New Roman" w:hAnsi="Times New Roman" w:cs="Times New Roman"/>
+          <w:b/>
+          <w:bCs/>
+          <w:kern w:val="0"/>
+          <w14:ligatures w14:val="none"/>
+        </w:rPr>
+      </w:pPr>
+    </w:p>
+    <w:p>
+      <w:pPr>
+        <w:spacing w:before="100" w:beforeAutospacing="1" w:after="100" w:afterAutospacing="1" w:line="240" w:lineRule="auto"/>
+        <w:rPr>
+          <w:rFonts w:ascii="Times New Roman" w:eastAsia="Times New Roman" w:hAnsi="Times New Roman" w:cs="Times New Roman"/>
+          <w:b/>
+          <w:bCs/>
+          <w:kern w:val="0"/>
+          <w14:ligatures w14:val="none"/>
+        </w:rPr>
+      </w:pPr>
+    </w:p>
+    <w:p>
+      <w:pPr>
+        <w:spacing w:before="100" w:beforeAutospacing="1" w:after="100" w:afterAutospacing="1" w:line="240" w:lineRule="auto"/>
+        <w:rPr>
+          <w:rFonts w:ascii="Times New Roman" w:eastAsia="Times New Roman" w:hAnsi="Times New Roman" w:cs="Times New Roman"/>
+          <w:kern w:val="0"/>
+          <w14:ligatures w14:val="none"/>
+        </w:rPr>
+      </w:pPr>
+      <w:r>
+        <w:rPr>
+          <w:rFonts w:ascii="Times New Roman" w:eastAsia="Times New Roman" w:hAnsi="Times New Roman" w:cs="Times New Roman"/>
+          <w:b/>
+          <w:bCs/>
+          <w:kern w:val="0"/>
+          <w14:ligatures w14:val="none"/>
+        </w:rPr>
+        <w:lastRenderedPageBreak/>
+        <w:t xml:space="preserve">Topic #32: People Interact </w:t>
+      </w:r>
+      <w:proofErr w:type="gramStart"/>
+      <w:r>
+        <w:rPr>
+          <w:rFonts w:ascii="Times New Roman" w:eastAsia="Times New Roman" w:hAnsi="Times New Roman" w:cs="Times New Roman"/>
+          <w:b/>
+          <w:bCs/>
+          <w:kern w:val="0"/>
+          <w14:ligatures w14:val="none"/>
+        </w:rPr>
+        <w:t>With</w:t>
+      </w:r>
+      <w:proofErr w:type="gramEnd"/>
+      <w:r>
+        <w:rPr>
+          <w:rFonts w:ascii="Times New Roman" w:eastAsia="Times New Roman" w:hAnsi="Times New Roman" w:cs="Times New Roman"/>
+          <w:b/>
+          <w:bCs/>
+          <w:kern w:val="0"/>
+          <w14:ligatures w14:val="none"/>
+        </w:rPr>
+        <w:t xml:space="preserve"> Conceptual Models</w:t>
+      </w:r>
+    </w:p>
+    <w:p>
+      <w:pPr>
+        <w:spacing w:before="100" w:beforeAutospacing="1" w:after="100" w:afterAutospacing="1" w:line="240" w:lineRule="auto"/>
+        <w:rPr>
+          <w:rFonts w:ascii="Times New Roman" w:eastAsia="Times New Roman" w:hAnsi="Times New Roman" w:cs="Times New Roman"/>
+          <w:kern w:val="0"/>
+          <w14:ligatures w14:val="none"/>
+        </w:rPr>
+      </w:pPr>
+      <w:r>
+        <w:rPr>
+          <w:rFonts w:ascii="Times New Roman" w:eastAsia="Times New Roman" w:hAnsi="Times New Roman" w:cs="Times New Roman"/>
+          <w:kern w:val="0"/>
+          <w14:ligatures w14:val="none"/>
+        </w:rPr>
+        <w:t>People use mental models</w:t>
+      </w:r>
+      <w:r>
+        <w:rPr>
+          <w:rFonts w:ascii="Times New Roman" w:eastAsia="Times New Roman" w:hAnsi="Times New Roman" w:cs="Times New Roman"/>
+          <w:kern w:val="0"/>
+          <w14:ligatures w14:val="none"/>
+        </w:rPr>
+        <w:t xml:space="preserve">; </w:t>
+      </w:r>
+      <w:r>
+        <w:rPr>
+          <w:rFonts w:ascii="Times New Roman" w:eastAsia="Times New Roman" w:hAnsi="Times New Roman" w:cs="Times New Roman"/>
+          <w:kern w:val="0"/>
+          <w14:ligatures w14:val="none"/>
+        </w:rPr>
+        <w:t>ideas in their head about how things work</w:t>
+      </w:r>
+      <w:r>
+        <w:rPr>
+          <w:rFonts w:ascii="Times New Roman" w:eastAsia="Times New Roman" w:hAnsi="Times New Roman" w:cs="Times New Roman"/>
+          <w:kern w:val="0"/>
+          <w14:ligatures w14:val="none"/>
+        </w:rPr>
+        <w:t xml:space="preserve">; </w:t>
+      </w:r>
+      <w:r>
+        <w:rPr>
+          <w:rFonts w:ascii="Times New Roman" w:eastAsia="Times New Roman" w:hAnsi="Times New Roman" w:cs="Times New Roman"/>
+          <w:kern w:val="0"/>
+          <w14:ligatures w14:val="none"/>
+        </w:rPr>
+        <w:t>to interact with technology. If a website or app works the way they expect, it feels easy to use. If it doesn’t, they can get frustrated or confused.</w:t>
+      </w:r>
+    </w:p>
+    <w:p>
+      <w:pPr>
+        <w:spacing w:before="100" w:beforeAutospacing="1" w:after="100" w:afterAutospacing="1" w:line="240" w:lineRule="auto"/>
+        <w:rPr>
+          <w:rFonts w:ascii="Times New Roman" w:eastAsia="Times New Roman" w:hAnsi="Times New Roman" w:cs="Times New Roman"/>
+          <w:kern w:val="0"/>
+          <w14:ligatures w14:val="none"/>
+        </w:rPr>
+      </w:pPr>
+      <w:r>
+        <w:rPr>
+          <w:rFonts w:ascii="Times New Roman" w:eastAsia="Times New Roman" w:hAnsi="Times New Roman" w:cs="Times New Roman"/>
+          <w:b/>
+          <w:bCs/>
+          <w:kern w:val="0"/>
+          <w14:ligatures w14:val="none"/>
+        </w:rPr>
+        <w:t>Embellishment:</w:t>
+      </w:r>
+      <w:r>
+        <w:rPr>
+          <w:rFonts w:ascii="Times New Roman" w:eastAsia="Times New Roman" w:hAnsi="Times New Roman" w:cs="Times New Roman"/>
+          <w:kern w:val="0"/>
+          <w14:ligatures w14:val="none"/>
+        </w:rPr>
+        <w:t xml:space="preserve"> One thing the reading didn’t mention is that everyone’s mental model is a little different. People from different backgrounds or experience levels might expect things to work differently. Designers can make products easier to use by offering multiple ways to navigate, giving helpful tips, or including tutorials. This helps make the design work for more people.</w:t>
+      </w:r>
+    </w:p>
+    <w:p>
+      <w:pPr>
+        <w:spacing w:before="100" w:beforeAutospacing="1" w:after="100" w:afterAutospacing="1" w:line="240" w:lineRule="auto"/>
+        <w:rPr>
+          <w:rFonts w:ascii="Times New Roman" w:eastAsia="Times New Roman" w:hAnsi="Times New Roman" w:cs="Times New Roman"/>
+          <w:kern w:val="0"/>
+          <w14:ligatures w14:val="none"/>
+        </w:rPr>
+      </w:pPr>
+      <w:r>
+        <w:rPr>
+          <w:rFonts w:ascii="Times New Roman" w:eastAsia="Times New Roman" w:hAnsi="Times New Roman" w:cs="Times New Roman"/>
+          <w:b/>
+          <w:bCs/>
+          <w:kern w:val="0"/>
+          <w14:ligatures w14:val="none"/>
+        </w:rPr>
+        <w:t>Visual Example:</w:t>
+      </w:r>
+      <w:r>
+        <w:rPr>
+          <w:rFonts w:ascii="Times New Roman" w:eastAsia="Times New Roman" w:hAnsi="Times New Roman" w:cs="Times New Roman"/>
+          <w:kern w:val="0"/>
+          <w14:ligatures w14:val="none"/>
+        </w:rPr>
+        <w:t xml:space="preserve"> </w:t>
+      </w:r>
+    </w:p>
+    <w:p>
+      <w:pPr>
+        <w:spacing w:before="100" w:beforeAutospacing="1" w:after="100" w:afterAutospacing="1" w:line="240" w:lineRule="auto"/>
+        <w:rPr>
+          <w:rFonts w:ascii="Times New Roman" w:eastAsia="Times New Roman" w:hAnsi="Times New Roman" w:cs="Times New Roman"/>
+          <w:kern w:val="0"/>
+          <w14:ligatures w14:val="none"/>
+        </w:rPr>
+      </w:pPr>
       <w:r>
         <w:rPr>
           <w:rFonts w:ascii="Times New Roman" w:eastAsia="Times New Roman" w:hAnsi="Times New Roman" w:cs="Times New Roman"/>
           <w:noProof/>
           <w:kern w:val="0"/>
         </w:rPr>
-        <w:lastRenderedPageBreak/>
-        <w:pict w14:anchorId="30F2FC25">
-          <v:rect id="_x0000_i1025" alt="" style="width:468pt;height:.05pt;mso-width-percent:0;mso-height-percent:0;mso-width-percent:0;mso-height-percent:0" o:hralign="center" o:hrstd="t" o:hr="t" fillcolor="#a0a0a0" stroked="f"/>
-        </w:pict>
-      </w:r>
-    </w:p>
-    <w:p>
-      <w:pPr>
-        <w:spacing w:before="100" w:beforeAutospacing="1" w:after="100" w:afterAutospacing="1" w:line="240" w:lineRule="auto"/>
-        <w:outlineLvl w:val="2"/>
-        <w:rPr>
-          <w:rFonts w:ascii="Times New Roman" w:eastAsia="Times New Roman" w:hAnsi="Times New Roman" w:cs="Times New Roman"/>
-          <w:b/>
-          <w:bCs/>
-          <w:color w:val="000000"/>
-          <w:kern w:val="0"/>
-          <w14:ligatures w14:val="none"/>
-        </w:rPr>
-      </w:pPr>
-      <w:r>
-        <w:rPr>
-          <w:rFonts w:ascii="Times New Roman" w:eastAsia="Times New Roman" w:hAnsi="Times New Roman" w:cs="Times New Roman"/>
-          <w:b/>
-          <w:bCs/>
-          <w:color w:val="000000"/>
-          <w:kern w:val="0"/>
-          <w14:ligatures w14:val="none"/>
-        </w:rPr>
-        <w:t>#40 – People Focus on What Stands Out</w:t>
-      </w:r>
-    </w:p>
-    <w:p>
-      <w:pPr>
-        <w:pStyle w:val="NormalWeb"/>
-        <w:rPr>
-          <w:color w:val="000000"/>
-        </w:rPr>
-      </w:pPr>
-      <w:r>
-        <w:rPr>
-          <w:rStyle w:val="Strong"/>
-          <w:rFonts w:eastAsiaTheme="majorEastAsia"/>
-          <w:color w:val="000000"/>
-        </w:rPr>
-        <w:t>Summary:</w:t>
-      </w:r>
-      <w:r>
-        <w:rPr>
-          <w:color w:val="000000"/>
-        </w:rPr>
-        <w:br/>
-        <w:t>People naturally pay attention first to whatever stands out the most on a webpage. This could be a large headline, a bright color, a bold button, or something placed in the center of the screen. Designers can use this to guide users toward important actions, such as signing up, purchasing a product, or reading key information.</w:t>
-      </w:r>
-    </w:p>
-    <w:p>
-      <w:pPr>
-        <w:pStyle w:val="NormalWeb"/>
-        <w:rPr>
-          <w:color w:val="000000"/>
-        </w:rPr>
-      </w:pPr>
-      <w:r>
-        <w:rPr>
-          <w:rStyle w:val="Strong"/>
-          <w:rFonts w:eastAsiaTheme="majorEastAsia"/>
-          <w:color w:val="000000"/>
-        </w:rPr>
-        <w:t>Embellishment:</w:t>
-      </w:r>
-      <w:r>
-        <w:rPr>
-          <w:color w:val="000000"/>
-        </w:rPr>
-        <w:br/>
-        <w:t>What the reading does not fully explain is how visual clutter can weaken this effect. If everything on a page is bold, colorful, or animated, then nothing truly stands out. This makes it harder for users to know what to focus on, which can slow them down or cause them to leave the site. Good design uses contrast, spacing, and simplicity to create a clear visual hierarchy. This means the most important content is easy to find, while less important information stays visible but not distracting.</w:t>
-      </w:r>
-    </w:p>
-    <w:p>
-      <w:pPr>
-        <w:spacing w:before="100" w:beforeAutospacing="1" w:after="100" w:afterAutospacing="1" w:line="240" w:lineRule="auto"/>
-        <w:rPr>
-          <w:rFonts w:ascii="Times New Roman" w:eastAsia="Times New Roman" w:hAnsi="Times New Roman" w:cs="Times New Roman"/>
-          <w:b/>
-          <w:bCs/>
-          <w:color w:val="000000"/>
-          <w:kern w:val="0"/>
-          <w14:ligatures w14:val="none"/>
-        </w:rPr>
-      </w:pPr>
-      <w:r>
-        <w:rPr>
-          <w:rFonts w:ascii="Times New Roman" w:eastAsia="Times New Roman" w:hAnsi="Times New Roman" w:cs="Times New Roman"/>
-          <w:b/>
-          <w:bCs/>
-          <w:color w:val="000000"/>
-          <w:kern w:val="0"/>
-          <w14:ligatures w14:val="none"/>
-        </w:rPr>
-        <w:t>Visual Example:</w:t>
-      </w:r>
-      <w:r>
-        <w:rPr>
-          <w:rFonts w:ascii="Times New Roman" w:eastAsia="Times New Roman" w:hAnsi="Times New Roman" w:cs="Times New Roman"/>
-          <w:color w:val="000000"/>
-          <w:kern w:val="0"/>
-          <w14:ligatures w14:val="none"/>
-        </w:rPr>
-        <w:br/>
-      </w:r>
-      <w:r>
-        <w:rPr>
-          <w:rFonts w:ascii="Times New Roman" w:eastAsia="Times New Roman" w:hAnsi="Times New Roman" w:cs="Times New Roman"/>
-          <w:noProof/>
-          <w:color w:val="000000"/>
-          <w:kern w:val="0"/>
-        </w:rPr>
         <w:drawing>
-          <wp:inline distT="0" distB="0" distL="0" distR="0" wp14:anchorId="67450F03" wp14:editId="0FECA0E2">
-            <wp:extent cx="4762500" cy="3111500"/>
+          <wp:inline distT="0" distB="0" distL="0" distR="0" wp14:anchorId="37395132" wp14:editId="2CCDC886">
+            <wp:extent cx="5080000" cy="3810000"/>
             <wp:effectExtent l="0" t="0" r="0" b="0"/>
-            <wp:docPr id="1959284750" name="Picture 2" descr="A screen shot of a website&#10;&#10;AI-generated content may be incorrect."/>
+            <wp:docPr id="1856843730" name="Picture 1" descr="A screenshot of a mobile phone&#10;&#10;AI-generated content may be incorrect."/>
             <wp:cNvGraphicFramePr>
               <a:graphicFrameLocks xmlns:a="http://schemas.openxmlformats.org/drawingml/2006/main" noChangeAspect="1"/>
             </wp:cNvGraphicFramePr>
@@ -339,7 +465,7 @@
               <a:graphicData uri="http://schemas.openxmlformats.org/drawingml/2006/picture">
                 <pic:pic xmlns:pic="http://schemas.openxmlformats.org/drawingml/2006/picture">
                   <pic:nvPicPr>
-                    <pic:cNvPr id="1959284750" name="Picture 2" descr="A screen shot of a website&#10;&#10;AI-generated content may be incorrect."/>
+                    <pic:cNvPr id="1856843730" name="Picture 1" descr="A screenshot of a mobile phone&#10;&#10;AI-generated content may be incorrect."/>
                     <pic:cNvPicPr/>
                   </pic:nvPicPr>
                   <pic:blipFill>
@@ -357,7 +483,7 @@
                   <pic:spPr>
                     <a:xfrm>
                       <a:off x="0" y="0"/>
-                      <a:ext cx="4762500" cy="3111500"/>
+                      <a:ext cx="5080000" cy="3810000"/>
                     </a:xfrm>
                     <a:prstGeom prst="rect">
                       <a:avLst/>
@@ -447,6 +573,19 @@
           <w14:ligatures w14:val="none"/>
         </w:rPr>
       </w:pPr>
+    </w:p>
+    <w:p>
+      <w:pPr>
+        <w:spacing w:before="100" w:beforeAutospacing="1" w:after="100" w:afterAutospacing="1" w:line="240" w:lineRule="auto"/>
+        <w:rPr>
+          <w:rFonts w:ascii="Times New Roman" w:eastAsia="Times New Roman" w:hAnsi="Times New Roman" w:cs="Times New Roman"/>
+          <w:b/>
+          <w:bCs/>
+          <w:color w:val="000000"/>
+          <w:kern w:val="0"/>
+          <w14:ligatures w14:val="none"/>
+        </w:rPr>
+      </w:pPr>
       <w:r>
         <w:rPr>
           <w:rFonts w:ascii="Times New Roman" w:eastAsia="Times New Roman" w:hAnsi="Times New Roman" w:cs="Times New Roman"/>
@@ -465,8 +604,6 @@
         <w:spacing w:before="100" w:beforeAutospacing="1" w:after="100" w:afterAutospacing="1" w:line="240" w:lineRule="auto"/>
         <w:rPr>
           <w:rFonts w:ascii="Times New Roman" w:eastAsia="Times New Roman" w:hAnsi="Times New Roman" w:cs="Times New Roman"/>
-          <w:b/>
-          <w:bCs/>
           <w:color w:val="000000"/>
           <w:kern w:val="0"/>
           <w14:ligatures w14:val="none"/>
@@ -477,33 +614,19 @@
           <w:rPr>
             <w:rStyle w:val="Hyperlink"/>
             <w:rFonts w:ascii="Times New Roman" w:eastAsia="Times New Roman" w:hAnsi="Times New Roman" w:cs="Times New Roman"/>
+            <w:b/>
+            <w:bCs/>
             <w:kern w:val="0"/>
             <w14:ligatures w14:val="none"/>
           </w:rPr>
-          <w:t>Net</w:t>
-        </w:r>
-        <w:r>
-          <w:rPr>
-            <w:rStyle w:val="Hyperlink"/>
-            <w:rFonts w:ascii="Times New Roman" w:eastAsia="Times New Roman" w:hAnsi="Times New Roman" w:cs="Times New Roman"/>
-            <w:kern w:val="0"/>
-            <w14:ligatures w14:val="none"/>
-          </w:rPr>
-          <w:t>f</w:t>
-        </w:r>
-        <w:r>
-          <w:rPr>
-            <w:rStyle w:val="Hyperlink"/>
-            <w:rFonts w:ascii="Times New Roman" w:eastAsia="Times New Roman" w:hAnsi="Times New Roman" w:cs="Times New Roman"/>
-            <w:kern w:val="0"/>
-            <w14:ligatures w14:val="none"/>
-          </w:rPr>
-          <w:t>lix.com</w:t>
+          <w:t>Mcdonalds.com</w:t>
         </w:r>
       </w:hyperlink>
       <w:r>
         <w:rPr>
           <w:rFonts w:ascii="Times New Roman" w:eastAsia="Times New Roman" w:hAnsi="Times New Roman" w:cs="Times New Roman"/>
+          <w:b/>
+          <w:bCs/>
           <w:color w:val="000000"/>
           <w:kern w:val="0"/>
           <w14:ligatures w14:val="none"/>
@@ -513,33 +636,11 @@
       <w:r>
         <w:rPr>
           <w:rFonts w:ascii="Times New Roman" w:eastAsia="Times New Roman" w:hAnsi="Times New Roman" w:cs="Times New Roman"/>
-          <w:b/>
-          <w:bCs/>
-          <w:color w:val="000000"/>
-          <w:kern w:val="0"/>
-          <w14:ligatures w14:val="none"/>
-        </w:rPr>
-        <w:t>Visited 1/27/26</w:t>
-      </w:r>
-      <w:r>
-        <w:rPr>
-          <w:rFonts w:ascii="Times New Roman" w:eastAsia="Times New Roman" w:hAnsi="Times New Roman" w:cs="Times New Roman"/>
-          <w:color w:val="000000"/>
-          <w:kern w:val="0"/>
-          <w14:ligatures w14:val="none"/>
-        </w:rPr>
-        <w:t xml:space="preserve"> </w:t>
-      </w:r>
-      <w:r>
-        <w:rPr>
-          <w:rFonts w:ascii="Times New Roman" w:eastAsia="Times New Roman" w:hAnsi="Times New Roman" w:cs="Times New Roman"/>
-          <w:b/>
-          <w:bCs/>
-          <w:color w:val="000000"/>
-          <w:kern w:val="0"/>
-          <w14:ligatures w14:val="none"/>
-        </w:rPr>
-        <w:t>Image used for Example</w:t>
+          <w:color w:val="000000"/>
+          <w:kern w:val="0"/>
+          <w14:ligatures w14:val="none"/>
+        </w:rPr>
+        <w:t>Visited 1/27/26 Screenshot of main mobile app layout</w:t>
       </w:r>
     </w:p>
     <w:p>
@@ -547,35 +648,11 @@
         <w:spacing w:before="100" w:beforeAutospacing="1" w:after="100" w:afterAutospacing="1" w:line="240" w:lineRule="auto"/>
         <w:rPr>
           <w:rFonts w:ascii="Times New Roman" w:eastAsia="Times New Roman" w:hAnsi="Times New Roman" w:cs="Times New Roman"/>
-          <w:b/>
-          <w:bCs/>
-          <w:color w:val="000000"/>
-          <w:kern w:val="0"/>
-          <w14:ligatures w14:val="none"/>
-        </w:rPr>
-      </w:pPr>
-      <w:r>
-        <w:rPr>
-          <w:rFonts w:ascii="Times New Roman" w:eastAsia="Times New Roman" w:hAnsi="Times New Roman" w:cs="Times New Roman"/>
-          <w:b/>
-          <w:bCs/>
-          <w:color w:val="000000"/>
-          <w:kern w:val="0"/>
-          <w14:ligatures w14:val="none"/>
-        </w:rPr>
-        <w:t>Medium</w:t>
-      </w:r>
-      <w:r>
-        <w:rPr>
-          <w:rFonts w:ascii="Times New Roman" w:eastAsia="Times New Roman" w:hAnsi="Times New Roman" w:cs="Times New Roman"/>
-          <w:b/>
-          <w:bCs/>
-          <w:color w:val="000000"/>
-          <w:kern w:val="0"/>
-          <w14:ligatures w14:val="none"/>
-        </w:rPr>
-        <w:t xml:space="preserve"> </w:t>
-      </w:r>
+          <w:color w:val="000000"/>
+          <w:kern w:val="0"/>
+          <w14:ligatures w14:val="none"/>
+        </w:rPr>
+      </w:pPr>
       <w:hyperlink r:id="rId7" w:history="1">
         <w:r>
           <w:rPr>
@@ -586,7 +663,7 @@
             <w:kern w:val="0"/>
             <w14:ligatures w14:val="none"/>
           </w:rPr>
-          <w:t>https://uxplanet.org/streamlining-the-checkout-experience-b4b00840884a?gi=6b67e60045e8</w:t>
+          <w:t>https://leadcapture.io/blog/multi-step-form-with-progress-bar/</w:t>
         </w:r>
       </w:hyperlink>
       <w:r>
@@ -598,7 +675,16 @@
           <w:kern w:val="0"/>
           <w14:ligatures w14:val="none"/>
         </w:rPr>
-        <w:t xml:space="preserve"> Visited 1/27/26 Image used for Example</w:t>
+        <w:t xml:space="preserve"> </w:t>
+      </w:r>
+      <w:r>
+        <w:rPr>
+          <w:rFonts w:ascii="Times New Roman" w:eastAsia="Times New Roman" w:hAnsi="Times New Roman" w:cs="Times New Roman"/>
+          <w:color w:val="000000"/>
+          <w:kern w:val="0"/>
+          <w14:ligatures w14:val="none"/>
+        </w:rPr>
+        <w:t>Used progress bar image 1/27/26</w:t>
       </w:r>
     </w:p>
     <w:p>
@@ -618,37 +704,226 @@
       <w:r>
         <w:rPr>
           <w:rFonts w:ascii="Times New Roman" w:eastAsia="Times New Roman" w:hAnsi="Times New Roman" w:cs="Times New Roman"/>
-          <w:b/>
-          <w:bCs/>
-          <w:color w:val="000000"/>
-          <w:kern w:val="0"/>
-          <w14:ligatures w14:val="none"/>
-        </w:rPr>
-        <w:t>100 things Every Designer Needs To Know About People</w:t>
-      </w:r>
-      <w:r>
-        <w:rPr>
-          <w:rFonts w:ascii="Times New Roman" w:eastAsia="Times New Roman" w:hAnsi="Times New Roman" w:cs="Times New Roman"/>
-          <w:b/>
-          <w:bCs/>
+          <w:color w:val="000000"/>
+          <w:kern w:val="0"/>
+          <w14:ligatures w14:val="none"/>
+        </w:rPr>
+        <w:t xml:space="preserve">100 things Every Designer Needs </w:t>
+      </w:r>
+      <w:proofErr w:type="gramStart"/>
+      <w:r>
+        <w:rPr>
+          <w:rFonts w:ascii="Times New Roman" w:eastAsia="Times New Roman" w:hAnsi="Times New Roman" w:cs="Times New Roman"/>
+          <w:color w:val="000000"/>
+          <w:kern w:val="0"/>
+          <w14:ligatures w14:val="none"/>
+        </w:rPr>
+        <w:t>To</w:t>
+      </w:r>
+      <w:proofErr w:type="gramEnd"/>
+      <w:r>
+        <w:rPr>
+          <w:rFonts w:ascii="Times New Roman" w:eastAsia="Times New Roman" w:hAnsi="Times New Roman" w:cs="Times New Roman"/>
+          <w:color w:val="000000"/>
+          <w:kern w:val="0"/>
+          <w14:ligatures w14:val="none"/>
+        </w:rPr>
+        <w:t xml:space="preserve"> Know About People </w:t>
+      </w:r>
+      <w:r>
+        <w:rPr>
+          <w:rFonts w:ascii="Times New Roman" w:eastAsia="Times New Roman" w:hAnsi="Times New Roman" w:cs="Times New Roman"/>
+          <w:i/>
+          <w:iCs/>
+          <w:color w:val="000000"/>
+          <w:kern w:val="0"/>
+          <w14:ligatures w14:val="none"/>
+        </w:rPr>
+        <w:t xml:space="preserve">Susan M. Weinschenk, </w:t>
+      </w:r>
+      <w:proofErr w:type="spellStart"/>
+      <w:r>
+        <w:rPr>
+          <w:rFonts w:ascii="Times New Roman" w:eastAsia="Times New Roman" w:hAnsi="Times New Roman" w:cs="Times New Roman"/>
+          <w:i/>
+          <w:iCs/>
+          <w:color w:val="000000"/>
+          <w:kern w:val="0"/>
+          <w14:ligatures w14:val="none"/>
+        </w:rPr>
+        <w:t>Ph.D</w:t>
+      </w:r>
+      <w:proofErr w:type="spellEnd"/>
+    </w:p>
+    <w:p>
+      <w:pPr>
+        <w:spacing w:before="100" w:beforeAutospacing="1" w:after="100" w:afterAutospacing="1" w:line="240" w:lineRule="auto"/>
+        <w:rPr>
+          <w:rFonts w:ascii="Times New Roman" w:eastAsia="Times New Roman" w:hAnsi="Times New Roman" w:cs="Times New Roman"/>
+          <w:i/>
+          <w:iCs/>
+          <w:color w:val="000000"/>
+          <w:kern w:val="0"/>
+          <w14:ligatures w14:val="none"/>
+        </w:rPr>
+      </w:pPr>
+      <w:r>
+        <w:rPr>
+          <w:rFonts w:ascii="Times New Roman" w:eastAsia="Times New Roman" w:hAnsi="Times New Roman" w:cs="Times New Roman"/>
+          <w:i/>
+          <w:iCs/>
+          <w:color w:val="000000"/>
+          <w:kern w:val="0"/>
+          <w14:ligatures w14:val="none"/>
+        </w:rPr>
+        <w:t xml:space="preserve">Topic </w:t>
+      </w:r>
+      <w:r>
+        <w:rPr>
+          <w:rFonts w:ascii="Times New Roman" w:eastAsia="Times New Roman" w:hAnsi="Times New Roman" w:cs="Times New Roman"/>
+          <w:i/>
+          <w:iCs/>
+          <w:color w:val="000000"/>
+          <w:kern w:val="0"/>
+          <w14:ligatures w14:val="none"/>
+        </w:rPr>
+        <w:t>#</w:t>
+      </w:r>
+      <w:r>
+        <w:rPr>
+          <w:rFonts w:ascii="Times New Roman" w:eastAsia="Times New Roman" w:hAnsi="Times New Roman" w:cs="Times New Roman"/>
+          <w:i/>
+          <w:iCs/>
+          <w:color w:val="000000"/>
+          <w:kern w:val="0"/>
+          <w14:ligatures w14:val="none"/>
+        </w:rPr>
+        <w:t>29</w:t>
+      </w:r>
+      <w:r>
+        <w:rPr>
+          <w:rFonts w:ascii="Times New Roman" w:eastAsia="Times New Roman" w:hAnsi="Times New Roman" w:cs="Times New Roman"/>
+          <w:i/>
+          <w:iCs/>
+          <w:color w:val="000000"/>
+          <w:kern w:val="0"/>
+          <w14:ligatures w14:val="none"/>
+        </w:rPr>
+        <w:t>:</w:t>
+      </w:r>
+      <w:r>
+        <w:rPr>
+          <w:rFonts w:ascii="Times New Roman" w:eastAsia="Times New Roman" w:hAnsi="Times New Roman" w:cs="Times New Roman"/>
+          <w:i/>
+          <w:iCs/>
+          <w:color w:val="000000"/>
+          <w:kern w:val="0"/>
+          <w14:ligatures w14:val="none"/>
+        </w:rPr>
+        <w:t xml:space="preserve"> Minds Wander 30 Percent </w:t>
+      </w:r>
+      <w:proofErr w:type="gramStart"/>
+      <w:r>
+        <w:rPr>
+          <w:rFonts w:ascii="Times New Roman" w:eastAsia="Times New Roman" w:hAnsi="Times New Roman" w:cs="Times New Roman"/>
+          <w:i/>
+          <w:iCs/>
+          <w:color w:val="000000"/>
+          <w:kern w:val="0"/>
+          <w14:ligatures w14:val="none"/>
+        </w:rPr>
+        <w:t>Of</w:t>
+      </w:r>
+      <w:proofErr w:type="gramEnd"/>
+      <w:r>
+        <w:rPr>
+          <w:rFonts w:ascii="Times New Roman" w:eastAsia="Times New Roman" w:hAnsi="Times New Roman" w:cs="Times New Roman"/>
+          <w:i/>
+          <w:iCs/>
           <w:color w:val="000000"/>
           <w:kern w:val="0"/>
           <w14:ligatures w14:val="none"/>
         </w:rPr>
         <w:t xml:space="preserve"> </w:t>
       </w:r>
-      <w:r>
-        <w:rPr>
-          <w:rFonts w:ascii="Times New Roman" w:eastAsia="Times New Roman" w:hAnsi="Times New Roman" w:cs="Times New Roman"/>
-          <w:b/>
-          <w:bCs/>
-          <w:i/>
-          <w:iCs/>
-          <w:color w:val="000000"/>
-          <w:kern w:val="0"/>
-          <w14:ligatures w14:val="none"/>
-        </w:rPr>
-        <w:t>Susan M. Weinschenk, Ph.D</w:t>
+      <w:proofErr w:type="gramStart"/>
+      <w:r>
+        <w:rPr>
+          <w:rFonts w:ascii="Times New Roman" w:eastAsia="Times New Roman" w:hAnsi="Times New Roman" w:cs="Times New Roman"/>
+          <w:i/>
+          <w:iCs/>
+          <w:color w:val="000000"/>
+          <w:kern w:val="0"/>
+          <w14:ligatures w14:val="none"/>
+        </w:rPr>
+        <w:t>The</w:t>
+      </w:r>
+      <w:proofErr w:type="gramEnd"/>
+      <w:r>
+        <w:rPr>
+          <w:rFonts w:ascii="Times New Roman" w:eastAsia="Times New Roman" w:hAnsi="Times New Roman" w:cs="Times New Roman"/>
+          <w:i/>
+          <w:iCs/>
+          <w:color w:val="000000"/>
+          <w:kern w:val="0"/>
+          <w14:ligatures w14:val="none"/>
+        </w:rPr>
+        <w:t xml:space="preserve"> Time </w:t>
+      </w:r>
+      <w:r>
+        <w:rPr>
+          <w:rFonts w:ascii="Times New Roman" w:eastAsia="Times New Roman" w:hAnsi="Times New Roman" w:cs="Times New Roman"/>
+          <w:i/>
+          <w:iCs/>
+          <w:color w:val="000000"/>
+          <w:kern w:val="0"/>
+          <w14:ligatures w14:val="none"/>
+        </w:rPr>
+        <w:t xml:space="preserve"> </w:t>
+      </w:r>
+      <w:r>
+        <w:rPr>
+          <w:rFonts w:ascii="Times New Roman" w:eastAsia="Times New Roman" w:hAnsi="Times New Roman" w:cs="Times New Roman"/>
+          <w:i/>
+          <w:iCs/>
+          <w:color w:val="000000"/>
+          <w:kern w:val="0"/>
+          <w14:ligatures w14:val="none"/>
+        </w:rPr>
+        <w:t>Pg.</w:t>
+      </w:r>
+      <w:r>
+        <w:rPr>
+          <w:rFonts w:ascii="Times New Roman" w:eastAsia="Times New Roman" w:hAnsi="Times New Roman" w:cs="Times New Roman"/>
+          <w:i/>
+          <w:iCs/>
+          <w:color w:val="000000"/>
+          <w:kern w:val="0"/>
+          <w14:ligatures w14:val="none"/>
+        </w:rPr>
+        <w:t>74</w:t>
+      </w:r>
+      <w:r>
+        <w:rPr>
+          <w:rFonts w:ascii="Times New Roman" w:eastAsia="Times New Roman" w:hAnsi="Times New Roman" w:cs="Times New Roman"/>
+          <w:i/>
+          <w:iCs/>
+          <w:color w:val="000000"/>
+          <w:kern w:val="0"/>
+          <w14:ligatures w14:val="none"/>
+        </w:rPr>
+        <w:t>-</w:t>
+      </w:r>
+      <w:r>
+        <w:rPr>
+          <w:rFonts w:ascii="Times New Roman" w:eastAsia="Times New Roman" w:hAnsi="Times New Roman" w:cs="Times New Roman"/>
+          <w:i/>
+          <w:iCs/>
+          <w:color w:val="000000"/>
+          <w:kern w:val="0"/>
+          <w14:ligatures w14:val="none"/>
+        </w:rPr>
+        <w:t>75</w:t>
       </w:r>
     </w:p>
     <w:p>
@@ -656,116 +931,98 @@
         <w:spacing w:before="100" w:beforeAutospacing="1" w:after="100" w:afterAutospacing="1" w:line="240" w:lineRule="auto"/>
         <w:rPr>
           <w:rFonts w:ascii="Times New Roman" w:eastAsia="Times New Roman" w:hAnsi="Times New Roman" w:cs="Times New Roman"/>
-          <w:b/>
-          <w:bCs/>
-          <w:i/>
-          <w:iCs/>
-          <w:color w:val="000000"/>
-          <w:kern w:val="0"/>
-          <w14:ligatures w14:val="none"/>
-        </w:rPr>
-      </w:pPr>
-      <w:r>
-        <w:rPr>
-          <w:rFonts w:ascii="Times New Roman" w:eastAsia="Times New Roman" w:hAnsi="Times New Roman" w:cs="Times New Roman"/>
-          <w:b/>
-          <w:bCs/>
-          <w:i/>
-          <w:iCs/>
-          <w:color w:val="000000"/>
-          <w:kern w:val="0"/>
-          <w14:ligatures w14:val="none"/>
-        </w:rPr>
-        <w:t xml:space="preserve">Topic </w:t>
-      </w:r>
-      <w:r>
-        <w:rPr>
-          <w:rFonts w:ascii="Times New Roman" w:eastAsia="Times New Roman" w:hAnsi="Times New Roman" w:cs="Times New Roman"/>
-          <w:b/>
-          <w:bCs/>
-          <w:i/>
-          <w:iCs/>
-          <w:color w:val="000000"/>
-          <w:kern w:val="0"/>
-          <w14:ligatures w14:val="none"/>
-        </w:rPr>
-        <w:t>#</w:t>
-      </w:r>
-      <w:r>
-        <w:rPr>
-          <w:rFonts w:ascii="Times New Roman" w:eastAsia="Times New Roman" w:hAnsi="Times New Roman" w:cs="Times New Roman"/>
-          <w:b/>
-          <w:bCs/>
-          <w:i/>
-          <w:iCs/>
-          <w:color w:val="000000"/>
-          <w:kern w:val="0"/>
-          <w14:ligatures w14:val="none"/>
-        </w:rPr>
-        <w:t>23</w:t>
-      </w:r>
-      <w:r>
-        <w:rPr>
-          <w:rFonts w:ascii="Times New Roman" w:eastAsia="Times New Roman" w:hAnsi="Times New Roman" w:cs="Times New Roman"/>
-          <w:b/>
-          <w:bCs/>
-          <w:i/>
-          <w:iCs/>
-          <w:color w:val="000000"/>
-          <w:kern w:val="0"/>
-          <w14:ligatures w14:val="none"/>
-        </w:rPr>
-        <w:t xml:space="preserve">: </w:t>
-      </w:r>
-      <w:r>
-        <w:rPr>
-          <w:rFonts w:ascii="Times New Roman" w:eastAsia="Times New Roman" w:hAnsi="Times New Roman" w:cs="Times New Roman"/>
-          <w:b/>
-          <w:bCs/>
-          <w:i/>
-          <w:iCs/>
-          <w:color w:val="000000"/>
-          <w:kern w:val="0"/>
-          <w14:ligatures w14:val="none"/>
-        </w:rPr>
-        <w:t>Pg.59</w:t>
-      </w:r>
-      <w:r>
-        <w:rPr>
-          <w:rFonts w:ascii="Times New Roman" w:eastAsia="Times New Roman" w:hAnsi="Times New Roman" w:cs="Times New Roman"/>
-          <w:b/>
-          <w:bCs/>
-          <w:i/>
-          <w:iCs/>
-          <w:color w:val="000000"/>
-          <w:kern w:val="0"/>
-          <w14:ligatures w14:val="none"/>
-        </w:rPr>
-        <w:t>-60</w:t>
-      </w:r>
-    </w:p>
-    <w:p>
-      <w:pPr>
-        <w:spacing w:before="100" w:beforeAutospacing="1" w:after="100" w:afterAutospacing="1" w:line="240" w:lineRule="auto"/>
-        <w:rPr>
-          <w:rFonts w:ascii="Times New Roman" w:eastAsia="Times New Roman" w:hAnsi="Times New Roman" w:cs="Times New Roman"/>
-          <w:color w:val="000000"/>
-          <w:kern w:val="0"/>
-          <w14:ligatures w14:val="none"/>
-        </w:rPr>
-      </w:pPr>
-      <w:r>
-        <w:rPr>
-          <w:rFonts w:ascii="Times New Roman" w:eastAsia="Times New Roman" w:hAnsi="Times New Roman" w:cs="Times New Roman"/>
-          <w:b/>
-          <w:bCs/>
-          <w:i/>
-          <w:iCs/>
-          <w:color w:val="000000"/>
-          <w:kern w:val="0"/>
-          <w14:ligatures w14:val="none"/>
-        </w:rPr>
-        <w:t>Topic #40: Pg.98-99</w:t>
+          <w:color w:val="000000"/>
+          <w:kern w:val="0"/>
+          <w14:ligatures w14:val="none"/>
+        </w:rPr>
+      </w:pPr>
+      <w:r>
+        <w:rPr>
+          <w:rFonts w:ascii="Times New Roman" w:eastAsia="Times New Roman" w:hAnsi="Times New Roman" w:cs="Times New Roman"/>
+          <w:i/>
+          <w:iCs/>
+          <w:color w:val="000000"/>
+          <w:kern w:val="0"/>
+          <w14:ligatures w14:val="none"/>
+        </w:rPr>
+        <w:t>Topic #</w:t>
+      </w:r>
+      <w:r>
+        <w:rPr>
+          <w:rFonts w:ascii="Times New Roman" w:eastAsia="Times New Roman" w:hAnsi="Times New Roman" w:cs="Times New Roman"/>
+          <w:i/>
+          <w:iCs/>
+          <w:color w:val="000000"/>
+          <w:kern w:val="0"/>
+          <w14:ligatures w14:val="none"/>
+        </w:rPr>
+        <w:t>32</w:t>
+      </w:r>
+      <w:r>
+        <w:rPr>
+          <w:rFonts w:ascii="Times New Roman" w:eastAsia="Times New Roman" w:hAnsi="Times New Roman" w:cs="Times New Roman"/>
+          <w:i/>
+          <w:iCs/>
+          <w:color w:val="000000"/>
+          <w:kern w:val="0"/>
+          <w14:ligatures w14:val="none"/>
+        </w:rPr>
+        <w:t>:</w:t>
+      </w:r>
+      <w:r>
+        <w:rPr>
+          <w:rFonts w:ascii="Times New Roman" w:eastAsia="Times New Roman" w:hAnsi="Times New Roman" w:cs="Times New Roman"/>
+          <w:i/>
+          <w:iCs/>
+          <w:color w:val="000000"/>
+          <w:kern w:val="0"/>
+          <w14:ligatures w14:val="none"/>
+        </w:rPr>
+        <w:t xml:space="preserve"> People Interact with Conceptual Modules </w:t>
+      </w:r>
+      <w:r>
+        <w:rPr>
+          <w:rFonts w:ascii="Times New Roman" w:eastAsia="Times New Roman" w:hAnsi="Times New Roman" w:cs="Times New Roman"/>
+          <w:i/>
+          <w:iCs/>
+          <w:color w:val="000000"/>
+          <w:kern w:val="0"/>
+          <w14:ligatures w14:val="none"/>
+        </w:rPr>
+        <w:t xml:space="preserve"> Pg.</w:t>
+      </w:r>
+      <w:r>
+        <w:rPr>
+          <w:rFonts w:ascii="Times New Roman" w:eastAsia="Times New Roman" w:hAnsi="Times New Roman" w:cs="Times New Roman"/>
+          <w:i/>
+          <w:iCs/>
+          <w:color w:val="000000"/>
+          <w:kern w:val="0"/>
+          <w14:ligatures w14:val="none"/>
+        </w:rPr>
+        <w:t xml:space="preserve"> 80</w:t>
+      </w:r>
+      <w:r>
+        <w:rPr>
+          <w:rFonts w:ascii="Times New Roman" w:eastAsia="Times New Roman" w:hAnsi="Times New Roman" w:cs="Times New Roman"/>
+          <w:i/>
+          <w:iCs/>
+          <w:color w:val="000000"/>
+          <w:kern w:val="0"/>
+          <w14:ligatures w14:val="none"/>
+        </w:rPr>
+        <w:t>-</w:t>
+      </w:r>
+      <w:r>
+        <w:rPr>
+          <w:rFonts w:ascii="Times New Roman" w:eastAsia="Times New Roman" w:hAnsi="Times New Roman" w:cs="Times New Roman"/>
+          <w:i/>
+          <w:iCs/>
+          <w:color w:val="000000"/>
+          <w:kern w:val="0"/>
+          <w14:ligatures w14:val="none"/>
+        </w:rPr>
+        <w:t>81</w:t>
       </w:r>
     </w:p>
     <w:sectPr>

</xml_diff>